<commit_message>
Disclose AI use in the master Methods so the NEE package complies, and re-clean rebuilt deliverables
The NEE package had no AI-use statement although Nature Portfolio requires LLM use
to be documented in the Methods. The bracketed draft now sits in the master as
section 2.14, so NEE and Nature Communications both carry it from one source; the
GEB build strips it from Methods because the Wiley package has its own disclosure
section. Word counts and display numbering in both journal packages are
unchanged. Rebuilt deliverables were cleaned with wm-clean after checking that
none shares an inode with 05_figures.
</commit_message>
<xml_diff>
--- a/06_manuscript/manuscript_v4_full.docx
+++ b/06_manuscript/manuscript_v4_full.docx
@@ -2,7 +2,7 @@
 <file path=word/document.xml><?xml version="1.0" encoding="utf-8"?>
 <w:document xmlns:w="http://schemas.openxmlformats.org/wordprocessingml/2006/main" xmlns:m="http://schemas.openxmlformats.org/officeDocument/2006/math" xmlns:r="http://schemas.openxmlformats.org/officeDocument/2006/relationships" xmlns:o="urn:schemas-microsoft-com:office:office" xmlns:v="urn:schemas-microsoft-com:vml" xmlns:w10="urn:schemas-microsoft-com:office:word" xmlns:a="http://schemas.openxmlformats.org/drawingml/2006/main" xmlns:pic="http://schemas.openxmlformats.org/drawingml/2006/picture" xmlns:wp="http://schemas.openxmlformats.org/drawingml/2006/wordprocessingDrawing">
   <w:body>
-    <w:bookmarkStart w:id="56" w:name="X25412cf3cdbf2eeeeeb50b306843c81459f6a87"/>
+    <w:bookmarkStart w:id="57" w:name="X25412cf3cdbf2eeeeeb50b306843c81459f6a87"/>
     <w:p>
       <w:pPr>
         <w:pStyle w:val="Heading1"/>
@@ -70,7 +70,7 @@
         <w:t xml:space="preserve"> </w:t>
       </w:r>
       <w:r>
-        <w:t xml:space="preserve">Abstract 198 | Main text 4,298 (Introduction 1,244, Results 1,791, Discussion 1,263) | Methods 2,258 | Figures 8 | Extended Data figures 25 | Supplementary Tables 28 | References 100</w:t>
+        <w:t xml:space="preserve">Abstract 198 | Main text 4,298 (Introduction 1,244, Results 1,791, Discussion 1,263) | Methods 2,414 | Figures 8 | Extended Data figures 25 | Supplementary Tables 28 | References 100</w:t>
       </w:r>
     </w:p>
     <w:p>
@@ -1305,7 +1305,7 @@
       </w:r>
     </w:p>
     <w:bookmarkEnd w:id="10"/>
-    <w:bookmarkStart w:id="24" w:name="materials-and-methods"/>
+    <w:bookmarkStart w:id="25" w:name="materials-and-methods"/>
     <w:p>
       <w:pPr>
         <w:pStyle w:val="Heading2"/>
@@ -3355,6 +3355,102 @@
         <w:t xml:space="preserve">(§ Data and code availability).</w:t>
       </w:r>
     </w:p>
+    <w:bookmarkEnd w:id="23"/>
+    <w:bookmarkStart w:id="24" w:name="use-of-ai-tools"/>
+    <w:p>
+      <w:pPr>
+        <w:pStyle w:val="Heading3"/>
+      </w:pPr>
+      <w:r>
+        <w:t xml:space="preserve">2.14 Use of AI tools</w:t>
+      </w:r>
+    </w:p>
+    <w:p>
+      <w:pPr>
+        <w:pStyle w:val="FirstParagraph"/>
+      </w:pPr>
+      <w:r>
+        <w:t xml:space="preserve">[AUTHOR TO CONFIRM BEFORE SUBMISSION — see 05_statements/AI_use_disclosure.md. Nature Portfolio requires LLM use to be documented in the Methods.]</w:t>
+      </w:r>
+      <w:r>
+        <w:t xml:space="preserve"> </w:t>
+      </w:r>
+      <w:r>
+        <w:t xml:space="preserve">An AI assistant (Claude; Anthropic), including the Opus 5 and Opus 5.5 models accessed</w:t>
+      </w:r>
+      <w:r>
+        <w:t xml:space="preserve"> </w:t>
+      </w:r>
+      <w:r>
+        <w:t xml:space="preserve">through Claude Code between August and October 2026, was used under the author’s direction</w:t>
+      </w:r>
+      <w:r>
+        <w:t xml:space="preserve"> </w:t>
+      </w:r>
+      <w:r>
+        <w:t xml:space="preserve">to write and run the R analysis code and produce the figures from that code; to draft and</w:t>
+      </w:r>
+      <w:r>
+        <w:t xml:space="preserve"> </w:t>
+      </w:r>
+      <w:r>
+        <w:t xml:space="preserve">revise the manuscript text, figure legends and Supplementary Information; and to check</w:t>
+      </w:r>
+      <w:r>
+        <w:t xml:space="preserve"> </w:t>
+      </w:r>
+      <w:r>
+        <w:t xml:space="preserve">references against Crossref records and reported values against the result tables. No</w:t>
+      </w:r>
+      <w:r>
+        <w:t xml:space="preserve"> </w:t>
+      </w:r>
+      <w:r>
+        <w:t xml:space="preserve">generative image model was used: every figure is a plot of data rendered by R code.</w:t>
+      </w:r>
+      <w:r>
+        <w:t xml:space="preserve"> </w:t>
+      </w:r>
+      <w:r>
+        <w:t xml:space="preserve">[AUTHOR TO CONFIRM — the author’s own role, for example:</w:t>
+      </w:r>
+      <w:r>
+        <w:t xml:space="preserve"> </w:t>
+      </w:r>
+      <w:r>
+        <w:t xml:space="preserve">“The author defined the research</w:t>
+      </w:r>
+      <w:r>
+        <w:t xml:space="preserve"> </w:t>
+      </w:r>
+      <w:r>
+        <w:t xml:space="preserve">aims, selected the data sources and analyses, reviewed all code, results and text, and takes</w:t>
+      </w:r>
+      <w:r>
+        <w:t xml:space="preserve"> </w:t>
+      </w:r>
+      <w:r>
+        <w:t xml:space="preserve">full responsibility for the content of this paper.”</w:t>
+      </w:r>
+      <w:r>
+        <w:t xml:space="preserve">]</w:t>
+      </w:r>
+      <w:r>
+        <w:t xml:space="preserve"> </w:t>
+      </w:r>
+      <w:r>
+        <w:t xml:space="preserve">[AUTHOR TO CONFIRM — any AI tools used outside this workflow, or</w:t>
+      </w:r>
+      <w:r>
+        <w:t xml:space="preserve"> </w:t>
+      </w:r>
+      <w:r>
+        <w:t xml:space="preserve">“None”</w:t>
+      </w:r>
+      <w:r>
+        <w:t xml:space="preserve">.]</w:t>
+      </w:r>
+    </w:p>
     <w:p>
       <w:r>
         <w:pict>
@@ -3362,9 +3458,9 @@
         </w:pict>
       </w:r>
     </w:p>
-    <w:bookmarkEnd w:id="23"/>
     <w:bookmarkEnd w:id="24"/>
-    <w:bookmarkStart w:id="34" w:name="results"/>
+    <w:bookmarkEnd w:id="25"/>
+    <w:bookmarkStart w:id="35" w:name="results"/>
     <w:p>
       <w:pPr>
         <w:pStyle w:val="Heading2"/>
@@ -3373,7 +3469,7 @@
         <w:t xml:space="preserve">3. Results</w:t>
       </w:r>
     </w:p>
-    <w:bookmarkStart w:id="25" w:name="X295f7430d2ea4ddf6b6e0fa3d17f62b1dd5b66f"/>
+    <w:bookmarkStart w:id="26" w:name="X295f7430d2ea4ddf6b6e0fa3d17f62b1dd5b66f"/>
     <w:p>
       <w:pPr>
         <w:pStyle w:val="Heading3"/>
@@ -3430,8 +3526,8 @@
         <w:t xml:space="preserve">refuted.</w:t>
       </w:r>
     </w:p>
-    <w:bookmarkEnd w:id="25"/>
-    <w:bookmarkStart w:id="26" w:name="X939f7929db348222c09812972da76fe21285ab1"/>
+    <w:bookmarkEnd w:id="26"/>
+    <w:bookmarkStart w:id="27" w:name="X939f7929db348222c09812972da76fe21285ab1"/>
     <w:p>
       <w:pPr>
         <w:pStyle w:val="Heading3"/>
@@ -3541,8 +3637,8 @@
         <w:t xml:space="preserve">side by side throughout.</w:t>
       </w:r>
     </w:p>
-    <w:bookmarkEnd w:id="26"/>
-    <w:bookmarkStart w:id="27" w:name="X7fa2776d4a5485ea5d498b89cbc90379ccd1347"/>
+    <w:bookmarkEnd w:id="27"/>
+    <w:bookmarkStart w:id="28" w:name="X7fa2776d4a5485ea5d498b89cbc90379ccd1347"/>
     <w:p>
       <w:pPr>
         <w:pStyle w:val="Heading3"/>
@@ -3660,8 +3756,8 @@
         <w:t xml:space="preserve">(habitat heterogeneity).</w:t>
       </w:r>
     </w:p>
-    <w:bookmarkEnd w:id="27"/>
-    <w:bookmarkStart w:id="28" w:name="X4cc65d108db81e63052a6875c9ad0e210d10d4d"/>
+    <w:bookmarkEnd w:id="28"/>
+    <w:bookmarkStart w:id="29" w:name="X4cc65d108db81e63052a6875c9ad0e210d10d4d"/>
     <w:p>
       <w:pPr>
         <w:pStyle w:val="Heading3"/>
@@ -4193,8 +4289,8 @@
         <w:t xml:space="preserve">heterogeneity legitimately changes along elevation; it has to be a covariate.</w:t>
       </w:r>
     </w:p>
-    <w:bookmarkEnd w:id="28"/>
-    <w:bookmarkStart w:id="29" w:name="X1f57fcc27f2e128e1113f97560a946a2b0694bc"/>
+    <w:bookmarkEnd w:id="29"/>
+    <w:bookmarkStart w:id="30" w:name="X1f57fcc27f2e128e1113f97560a946a2b0694bc"/>
     <w:p>
       <w:pPr>
         <w:pStyle w:val="Heading3"/>
@@ -4259,8 +4355,8 @@
         <w:t xml:space="preserve">significant after BH correction.</w:t>
       </w:r>
     </w:p>
-    <w:bookmarkEnd w:id="29"/>
-    <w:bookmarkStart w:id="30" w:name="X4b9624569c3bb29efb7a0fa7506d9ad6d329d29"/>
+    <w:bookmarkEnd w:id="30"/>
+    <w:bookmarkStart w:id="31" w:name="X4b9624569c3bb29efb7a0fa7506d9ad6d329d29"/>
     <w:p>
       <w:pPr>
         <w:pStyle w:val="Heading3"/>
@@ -4326,8 +4422,8 @@
         <w:t xml:space="preserve">constrained CWM models identify.</w:t>
       </w:r>
     </w:p>
-    <w:bookmarkEnd w:id="30"/>
-    <w:bookmarkStart w:id="31" w:name="no-class-substitutes-for-another"/>
+    <w:bookmarkEnd w:id="31"/>
+    <w:bookmarkStart w:id="32" w:name="no-class-substitutes-for-another"/>
     <w:p>
       <w:pPr>
         <w:pStyle w:val="Heading3"/>
@@ -4554,8 +4650,8 @@
         <w:t xml:space="preserve">zero.</w:t>
       </w:r>
     </w:p>
-    <w:bookmarkEnd w:id="31"/>
-    <w:bookmarkStart w:id="32" w:name="X73d1057187d884d0eac2418a3b8303ca4446e32"/>
+    <w:bookmarkEnd w:id="32"/>
+    <w:bookmarkStart w:id="33" w:name="X73d1057187d884d0eac2418a3b8303ca4446e32"/>
     <w:p>
       <w:pPr>
         <w:pStyle w:val="Heading3"/>
@@ -4866,8 +4962,8 @@
         <w:t xml:space="preserve">are the easiest to cover incidentally. H3 is not refuted.</w:t>
       </w:r>
     </w:p>
-    <w:bookmarkEnd w:id="32"/>
-    <w:bookmarkStart w:id="33" w:name="X43ddd162a38ebc2e3c33125fcdc8819a5d14213"/>
+    <w:bookmarkEnd w:id="33"/>
+    <w:bookmarkStart w:id="34" w:name="X43ddd162a38ebc2e3c33125fcdc8819a5d14213"/>
     <w:p>
       <w:pPr>
         <w:pStyle w:val="Heading3"/>
@@ -5043,9 +5139,9 @@
         </w:pict>
       </w:r>
     </w:p>
-    <w:bookmarkEnd w:id="33"/>
     <w:bookmarkEnd w:id="34"/>
-    <w:bookmarkStart w:id="41" w:name="discussion"/>
+    <w:bookmarkEnd w:id="35"/>
+    <w:bookmarkStart w:id="42" w:name="discussion"/>
     <w:p>
       <w:pPr>
         <w:pStyle w:val="Heading2"/>
@@ -5098,7 +5194,7 @@
         <w:t xml:space="preserve">(Q3).</w:t>
       </w:r>
     </w:p>
-    <w:bookmarkStart w:id="35" w:name="X0e2dbbff725774af4afbe885c2a7e396a3fd4b0"/>
+    <w:bookmarkStart w:id="36" w:name="X0e2dbbff725774af4afbe885c2a7e396a3fd4b0"/>
     <w:p>
       <w:pPr>
         <w:pStyle w:val="Heading3"/>
@@ -5228,8 +5324,8 @@
         <w:t xml:space="preserve">and guards against both failure modes.</w:t>
       </w:r>
     </w:p>
-    <w:bookmarkEnd w:id="35"/>
-    <w:bookmarkStart w:id="36" w:name="X41488f553e9590a1b34606b069cb06a478d5e87"/>
+    <w:bookmarkEnd w:id="36"/>
+    <w:bookmarkStart w:id="37" w:name="X41488f553e9590a1b34606b069cb06a478d5e87"/>
     <w:p>
       <w:pPr>
         <w:pStyle w:val="Heading3"/>
@@ -5378,8 +5474,8 @@
         <w:t xml:space="preserve">climate-exposed, and warming should reorganise it faster.</w:t>
       </w:r>
     </w:p>
-    <w:bookmarkEnd w:id="36"/>
-    <w:bookmarkStart w:id="37" w:name="Xc49e37d63831180308cfda46f0db1847147460d"/>
+    <w:bookmarkEnd w:id="37"/>
+    <w:bookmarkStart w:id="38" w:name="Xc49e37d63831180308cfda46f0db1847147460d"/>
     <w:p>
       <w:pPr>
         <w:pStyle w:val="Heading3"/>
@@ -5504,8 +5600,8 @@
         <w:t xml:space="preserve">that secretly carries temperature) can masquerade as mechanism.</w:t>
       </w:r>
     </w:p>
-    <w:bookmarkEnd w:id="37"/>
-    <w:bookmarkStart w:id="38" w:name="Xff1ca52bf0b7a532fa6b6740ce7ce9fd32985f5"/>
+    <w:bookmarkEnd w:id="38"/>
+    <w:bookmarkStart w:id="39" w:name="Xff1ca52bf0b7a532fa6b6740ce7ce9fd32985f5"/>
     <w:p>
       <w:pPr>
         <w:pStyle w:val="Heading3"/>
@@ -5694,8 +5790,8 @@
         <w:t xml:space="preserve">conservation outcome equivalent to protection.</w:t>
       </w:r>
     </w:p>
-    <w:bookmarkEnd w:id="38"/>
-    <w:bookmarkStart w:id="39" w:name="limitations"/>
+    <w:bookmarkEnd w:id="39"/>
+    <w:bookmarkStart w:id="40" w:name="limitations"/>
     <w:p>
       <w:pPr>
         <w:pStyle w:val="Heading3"/>
@@ -5921,8 +6017,8 @@
         <w:t xml:space="preserve">should not be cited independently of the grid-cell result.</w:t>
       </w:r>
     </w:p>
-    <w:bookmarkEnd w:id="39"/>
-    <w:bookmarkStart w:id="40" w:name="conclusions-and-outlook"/>
+    <w:bookmarkEnd w:id="40"/>
+    <w:bookmarkStart w:id="41" w:name="conclusions-and-outlook"/>
     <w:p>
       <w:pPr>
         <w:pStyle w:val="Heading3"/>
@@ -6012,9 +6108,9 @@
         </w:pict>
       </w:r>
     </w:p>
-    <w:bookmarkEnd w:id="40"/>
     <w:bookmarkEnd w:id="41"/>
-    <w:bookmarkStart w:id="42" w:name="data-and-code-availability"/>
+    <w:bookmarkEnd w:id="42"/>
+    <w:bookmarkStart w:id="43" w:name="data-and-code-availability"/>
     <w:p>
       <w:pPr>
         <w:pStyle w:val="Heading2"/>
@@ -6132,8 +6228,8 @@
         <w:t xml:space="preserve">.</w:t>
       </w:r>
     </w:p>
-    <w:bookmarkEnd w:id="42"/>
-    <w:bookmarkStart w:id="43" w:name="author-contributions"/>
+    <w:bookmarkEnd w:id="43"/>
+    <w:bookmarkStart w:id="44" w:name="author-contributions"/>
     <w:p>
       <w:pPr>
         <w:pStyle w:val="Heading2"/>
@@ -6156,8 +6252,8 @@
         <w:t xml:space="preserve">the figures and wrote the manuscript.</w:t>
       </w:r>
     </w:p>
-    <w:bookmarkEnd w:id="43"/>
-    <w:bookmarkStart w:id="44" w:name="competing-interests"/>
+    <w:bookmarkEnd w:id="44"/>
+    <w:bookmarkStart w:id="45" w:name="competing-interests"/>
     <w:p>
       <w:pPr>
         <w:pStyle w:val="Heading2"/>
@@ -6181,8 +6277,8 @@
         </w:pict>
       </w:r>
     </w:p>
-    <w:bookmarkEnd w:id="44"/>
-    <w:bookmarkStart w:id="53" w:name="figure-legends"/>
+    <w:bookmarkEnd w:id="45"/>
+    <w:bookmarkStart w:id="54" w:name="figure-legends"/>
     <w:p>
       <w:pPr>
         <w:pStyle w:val="Heading2"/>
@@ -6191,7 +6287,7 @@
         <w:t xml:space="preserve">Figure legends</w:t>
       </w:r>
     </w:p>
-    <w:bookmarkStart w:id="45" w:name="X0aa59cf7991c442f6d436565d112937517609dd"/>
+    <w:bookmarkStart w:id="46" w:name="X0aa59cf7991c442f6d436565d112937517609dd"/>
     <w:p>
       <w:pPr>
         <w:pStyle w:val="Heading3"/>
@@ -6283,8 +6379,8 @@
         <w:t xml:space="preserve">class. Grey cells hold fewer than two species of that class; they are not absences.</w:t>
       </w:r>
     </w:p>
-    <w:bookmarkEnd w:id="45"/>
-    <w:bookmarkStart w:id="46" w:name="X6baa16c06355acd6eacfa1cd17f5d2d2cc3d2e0"/>
+    <w:bookmarkEnd w:id="46"/>
+    <w:bookmarkStart w:id="47" w:name="X6baa16c06355acd6eacfa1cd17f5d2d2cc3d2e0"/>
     <w:p>
       <w:pPr>
         <w:pStyle w:val="Heading3"/>
@@ -6453,8 +6549,8 @@
         <w:t xml:space="preserve">uncorrelated with size whatever the raw correlation.</w:t>
       </w:r>
     </w:p>
-    <w:bookmarkEnd w:id="46"/>
-    <w:bookmarkStart w:id="47" w:name="X87eb59cb4e9aef0500424ae43aeb8b68275c0c1"/>
+    <w:bookmarkEnd w:id="47"/>
+    <w:bookmarkStart w:id="48" w:name="X87eb59cb4e9aef0500424ae43aeb8b68275c0c1"/>
     <w:p>
       <w:pPr>
         <w:pStyle w:val="Heading3"/>
@@ -6562,8 +6658,8 @@
         <w:t xml:space="preserve">87%, amphibians 53% of analysable land cells.</w:t>
       </w:r>
     </w:p>
-    <w:bookmarkEnd w:id="47"/>
-    <w:bookmarkStart w:id="48" w:name="X744c70a2dfa1a933c4dec8a32e9badcc8622910"/>
+    <w:bookmarkEnd w:id="48"/>
+    <w:bookmarkStart w:id="49" w:name="X744c70a2dfa1a933c4dec8a32e9badcc8622910"/>
     <w:p>
       <w:pPr>
         <w:pStyle w:val="Heading3"/>
@@ -6712,8 +6808,8 @@
         <w:t xml:space="preserve">dilutes rather than concentrates the environmental signal.</w:t>
       </w:r>
     </w:p>
-    <w:bookmarkEnd w:id="48"/>
-    <w:bookmarkStart w:id="49" w:name="X7806e1177b1962ed6838846918071773a3e99fb"/>
+    <w:bookmarkEnd w:id="49"/>
+    <w:bookmarkStart w:id="50" w:name="X7806e1177b1962ed6838846918071773a3e99fb"/>
     <w:p>
       <w:pPr>
         <w:pStyle w:val="Heading3"/>
@@ -6885,8 +6981,8 @@
         <w:t xml:space="preserve">family-specific spatial autoregressive error models on the 50-km grid.</w:t>
       </w:r>
     </w:p>
-    <w:bookmarkEnd w:id="49"/>
-    <w:bookmarkStart w:id="50" w:name="X4f0efc32b458e4d7636ddcee2bdb8f033663a77"/>
+    <w:bookmarkEnd w:id="50"/>
+    <w:bookmarkStart w:id="51" w:name="X4f0efc32b458e4d7636ddcee2bdb8f033663a77"/>
     <w:p>
       <w:pPr>
         <w:pStyle w:val="Heading3"/>
@@ -7025,8 +7121,8 @@
         <w:t xml:space="preserve">trait bar, 12 per axis bar).</w:t>
       </w:r>
     </w:p>
-    <w:bookmarkEnd w:id="50"/>
-    <w:bookmarkStart w:id="51" w:name="X11dab106384de61d4b0194369141b06af93188f"/>
+    <w:bookmarkEnd w:id="51"/>
+    <w:bookmarkStart w:id="52" w:name="X11dab106384de61d4b0194369141b06af93188f"/>
     <w:p>
       <w:pPr>
         <w:pStyle w:val="Heading3"/>
@@ -7186,8 +7282,8 @@
         <w:t xml:space="preserve">largely reflect imputed values.</w:t>
       </w:r>
     </w:p>
-    <w:bookmarkEnd w:id="51"/>
-    <w:bookmarkStart w:id="52" w:name="Xa733520e77d6028107887660bf60ce3741b97f4"/>
+    <w:bookmarkEnd w:id="52"/>
+    <w:bookmarkStart w:id="53" w:name="Xa733520e77d6028107887660bf60ce3741b97f4"/>
     <w:p>
       <w:pPr>
         <w:pStyle w:val="Heading3"/>
@@ -7397,9 +7493,9 @@
         </w:pict>
       </w:r>
     </w:p>
-    <w:bookmarkEnd w:id="52"/>
     <w:bookmarkEnd w:id="53"/>
-    <w:bookmarkStart w:id="54" w:name="extended-data-figure-legends"/>
+    <w:bookmarkEnd w:id="54"/>
+    <w:bookmarkStart w:id="55" w:name="extended-data-figure-legends"/>
     <w:p>
       <w:pPr>
         <w:pStyle w:val="Heading2"/>
@@ -8676,8 +8772,8 @@
         <w:t xml:space="preserve">caution, not as a biological contrast.</w:t>
       </w:r>
     </w:p>
-    <w:bookmarkEnd w:id="54"/>
-    <w:bookmarkStart w:id="55" w:name="references"/>
+    <w:bookmarkEnd w:id="55"/>
+    <w:bookmarkStart w:id="56" w:name="references"/>
     <w:p>
       <w:pPr>
         <w:pStyle w:val="Heading2"/>
@@ -12074,8 +12170,8 @@
         <w:t xml:space="preserve">[钟雨茜等]</w:t>
       </w:r>
     </w:p>
-    <w:bookmarkEnd w:id="55"/>
     <w:bookmarkEnd w:id="56"/>
+    <w:bookmarkEnd w:id="57"/>
     <w:sectPr>
       <w:footnotePr>
         <w:numRestart w:val="eachSect"/>

</xml_diff>